<commit_message>
feat(pd): localidad, provincia, comunidad, regimen dual, contenidos de las sesiones, proyectos y retos, actividades de evaluacion y caracteristicas del alumnado llegan a PD-, PD= y PD+
Co-Authored-By: Claude Sonnet 5.5 <noreply@anthropic.com>
</commit_message>
<xml_diff>
--- a/backend/templates/modelo_pd_jeg_tpl_final.docx
+++ b/backend/templates/modelo_pd_jeg_tpl_final.docx
@@ -4309,6 +4309,150 @@
               <w:cnfStyle w:val="000000000000" w:firstRow="0" w:lastRow="0" w:firstColumn="0" w:lastColumn="0" w:oddVBand="0" w:evenVBand="0" w:oddHBand="0" w:evenHBand="0" w:firstRowFirstColumn="0" w:firstRowLastColumn="0" w:lastRowFirstColumn="0" w:lastRowLastColumn="0"/>
             </w:pPr>
             <w:r>
+              <w:t>Localidad</w:t>
+            </w:r>
+          </w:p>
+        </w:tc>
+        <w:tc>
+          <w:tcPr>
+            <w:tcW w:w="4252" w:type="dxa"/>
+          </w:tcPr>
+          <w:p>
+            <w:pPr>
+              <w:pStyle w:val="Tabla-Contenido"/>
+              <w:cnfStyle w:val="000000000000" w:firstRow="0" w:lastRow="0" w:firstColumn="0" w:lastColumn="0" w:oddVBand="0" w:evenVBand="0" w:oddHBand="0" w:evenHBand="0" w:firstRowFirstColumn="0" w:firstRowLastColumn="0" w:lastRowFirstColumn="0" w:lastRowLastColumn="0"/>
+            </w:pPr>
+            <w:r>
+              <w:t>{{ municipio }}</w:t>
+            </w:r>
+          </w:p>
+        </w:tc>
+      </w:tr>
+      <w:tr>
+        <w:tc>
+          <w:tcPr>
+            <w:cnfStyle w:val="001000000000" w:firstRow="0" w:lastRow="0" w:firstColumn="1" w:lastColumn="0" w:oddVBand="0" w:evenVBand="0" w:oddHBand="0" w:evenHBand="0" w:firstRowFirstColumn="0" w:firstRowLastColumn="0" w:lastRowFirstColumn="0" w:lastRowLastColumn="0"/>
+            <w:tcW w:w="1701" w:type="dxa"/>
+            <w:vMerge/>
+          </w:tcPr>
+          <w:p>
+            <w:pPr>
+              <w:pStyle w:val="Tabla-Encabezado"/>
+              <w:jc w:val="left"/>
+              <w:rPr>
+                <w:b/>
+              </w:rPr>
+            </w:pPr>
+          </w:p>
+        </w:tc>
+        <w:tc>
+          <w:tcPr>
+            <w:tcW w:w="2552" w:type="dxa"/>
+            <w:shd w:val="clear" w:color="auto" w:fill="F2F2F2" w:themeFill="background1" w:themeFillShade="F2"/>
+          </w:tcPr>
+          <w:p>
+            <w:pPr>
+              <w:pStyle w:val="Tabla-Encabezado"/>
+              <w:jc w:val="left"/>
+              <w:cnfStyle w:val="000000000000" w:firstRow="0" w:lastRow="0" w:firstColumn="0" w:lastColumn="0" w:oddVBand="0" w:evenVBand="0" w:oddHBand="0" w:evenHBand="0" w:firstRowFirstColumn="0" w:firstRowLastColumn="0" w:lastRowFirstColumn="0" w:lastRowLastColumn="0"/>
+            </w:pPr>
+            <w:r>
+              <w:t>Provincia</w:t>
+            </w:r>
+          </w:p>
+        </w:tc>
+        <w:tc>
+          <w:tcPr>
+            <w:tcW w:w="4252" w:type="dxa"/>
+          </w:tcPr>
+          <w:p>
+            <w:pPr>
+              <w:pStyle w:val="Tabla-Contenido"/>
+              <w:cnfStyle w:val="000000000000" w:firstRow="0" w:lastRow="0" w:firstColumn="0" w:lastColumn="0" w:oddVBand="0" w:evenVBand="0" w:oddHBand="0" w:evenHBand="0" w:firstRowFirstColumn="0" w:firstRowLastColumn="0" w:lastRowFirstColumn="0" w:lastRowLastColumn="0"/>
+            </w:pPr>
+            <w:r>
+              <w:t>{{ provincia }}</w:t>
+            </w:r>
+          </w:p>
+        </w:tc>
+      </w:tr>
+      <w:tr>
+        <w:tc>
+          <w:tcPr>
+            <w:cnfStyle w:val="001000000000" w:firstRow="0" w:lastRow="0" w:firstColumn="1" w:lastColumn="0" w:oddVBand="0" w:evenVBand="0" w:oddHBand="0" w:evenHBand="0" w:firstRowFirstColumn="0" w:firstRowLastColumn="0" w:lastRowFirstColumn="0" w:lastRowLastColumn="0"/>
+            <w:tcW w:w="1701" w:type="dxa"/>
+            <w:vMerge/>
+          </w:tcPr>
+          <w:p>
+            <w:pPr>
+              <w:pStyle w:val="Tabla-Encabezado"/>
+              <w:jc w:val="left"/>
+              <w:rPr>
+                <w:b/>
+              </w:rPr>
+            </w:pPr>
+          </w:p>
+        </w:tc>
+        <w:tc>
+          <w:tcPr>
+            <w:tcW w:w="2552" w:type="dxa"/>
+            <w:shd w:val="clear" w:color="auto" w:fill="F2F2F2" w:themeFill="background1" w:themeFillShade="F2"/>
+          </w:tcPr>
+          <w:p>
+            <w:pPr>
+              <w:pStyle w:val="Tabla-Encabezado"/>
+              <w:jc w:val="left"/>
+              <w:cnfStyle w:val="000000000000" w:firstRow="0" w:lastRow="0" w:firstColumn="0" w:lastColumn="0" w:oddVBand="0" w:evenVBand="0" w:oddHBand="0" w:evenHBand="0" w:firstRowFirstColumn="0" w:firstRowLastColumn="0" w:lastRowFirstColumn="0" w:lastRowLastColumn="0"/>
+            </w:pPr>
+            <w:r>
+              <w:t>Comunidad autónoma</w:t>
+            </w:r>
+          </w:p>
+        </w:tc>
+        <w:tc>
+          <w:tcPr>
+            <w:tcW w:w="4252" w:type="dxa"/>
+          </w:tcPr>
+          <w:p>
+            <w:pPr>
+              <w:pStyle w:val="Tabla-Contenido"/>
+              <w:cnfStyle w:val="000000000000" w:firstRow="0" w:lastRow="0" w:firstColumn="0" w:lastColumn="0" w:oddVBand="0" w:evenVBand="0" w:oddHBand="0" w:evenHBand="0" w:firstRowFirstColumn="0" w:firstRowLastColumn="0" w:lastRowFirstColumn="0" w:lastRowLastColumn="0"/>
+            </w:pPr>
+            <w:r>
+              <w:t>{{ comunidad_autonoma }}</w:t>
+            </w:r>
+          </w:p>
+        </w:tc>
+      </w:tr>
+      <w:tr>
+        <w:tc>
+          <w:tcPr>
+            <w:cnfStyle w:val="001000000000" w:firstRow="0" w:lastRow="0" w:firstColumn="1" w:lastColumn="0" w:oddVBand="0" w:evenVBand="0" w:oddHBand="0" w:evenHBand="0" w:firstRowFirstColumn="0" w:firstRowLastColumn="0" w:lastRowFirstColumn="0" w:lastRowLastColumn="0"/>
+            <w:tcW w:w="1701" w:type="dxa"/>
+            <w:vMerge/>
+          </w:tcPr>
+          <w:p>
+            <w:pPr>
+              <w:pStyle w:val="Tabla-Encabezado"/>
+              <w:jc w:val="left"/>
+              <w:rPr>
+                <w:b/>
+              </w:rPr>
+            </w:pPr>
+          </w:p>
+        </w:tc>
+        <w:tc>
+          <w:tcPr>
+            <w:tcW w:w="2552" w:type="dxa"/>
+            <w:shd w:val="clear" w:color="auto" w:fill="F2F2F2" w:themeFill="background1" w:themeFillShade="F2"/>
+          </w:tcPr>
+          <w:p>
+            <w:pPr>
+              <w:pStyle w:val="Tabla-Encabezado"/>
+              <w:jc w:val="left"/>
+              <w:cnfStyle w:val="000000000000" w:firstRow="0" w:lastRow="0" w:firstColumn="0" w:lastColumn="0" w:oddVBand="0" w:evenVBand="0" w:oddHBand="0" w:evenHBand="0" w:firstRowFirstColumn="0" w:firstRowLastColumn="0" w:lastRowFirstColumn="0" w:lastRowLastColumn="0"/>
+            </w:pPr>
+            <w:r>
               <w:t>Curso académico</w:t>
             </w:r>
           </w:p>
@@ -11734,6 +11878,42 @@
       <w:r>
         <w:t/>
       </w:r>
+    </w:p>
+    <w:p>
+      <w:r>
+        <w:t>{%p for x in list_actividades_eval %}</w:t>
+      </w:r>
+      <w:r>
+        <w:rPr>
+          <w:b/>
+          <w:bCs/>
+        </w:rPr>
+      </w:r>
+      <w:r/>
+    </w:p>
+    <w:p>
+      <w:r>
+        <w:t>{{ x }}</w:t>
+      </w:r>
+      <w:r>
+        <w:rPr>
+          <w:b/>
+          <w:bCs/>
+        </w:rPr>
+      </w:r>
+      <w:r/>
+    </w:p>
+    <w:p>
+      <w:r>
+        <w:t>{%p endfor %}</w:t>
+      </w:r>
+      <w:r>
+        <w:rPr>
+          <w:b/>
+          <w:bCs/>
+        </w:rPr>
+      </w:r>
+      <w:r/>
     </w:p>
     <w:p>
       <w:pPr>

</xml_diff>